<commit_message>
sua theo yeu cau
</commit_message>
<xml_diff>
--- a/ss3_ma_gia_luu_do/bai_tap/bai_tap_cau_truc_dieu_kien.docx
+++ b/ss3_ma_gia_luu_do/bai_tap/bai_tap_cau_truc_dieu_kien.docx
@@ -94,7 +94,7 @@
           <w:lang w:val="en-US"/>
         </w:rPr>
         <w:tab/>
-        <w:t>IF N &lt; 75 AND N=&gt;60</w:t>
+        <w:t>IF N=&gt;60</w:t>
       </w:r>
     </w:p>
     <w:p>
@@ -388,14 +388,13 @@
       <w:r>
         <w:rPr>
           <w:noProof/>
-          <w:lang w:val="en-US"/>
         </w:rPr>
         <w:lastRenderedPageBreak/>
         <w:drawing>
           <wp:inline distT="0" distB="0" distL="0" distR="0">
             <wp:extent cx="4389120" cy="7155180"/>
             <wp:effectExtent l="0" t="0" r="0" b="7620"/>
-            <wp:docPr id="1" name="Picture 1" descr="C:\Users\Administrator\Downloads\Untitled Diagram.drawio.png"/>
+            <wp:docPr id="2" name="Picture 2"/>
             <wp:cNvGraphicFramePr>
               <a:graphicFrameLocks xmlns:a="http://schemas.openxmlformats.org/drawingml/2006/main" noChangeAspect="1"/>
             </wp:cNvGraphicFramePr>
@@ -403,7 +402,7 @@
               <a:graphicData uri="http://schemas.openxmlformats.org/drawingml/2006/picture">
                 <pic:pic xmlns:pic="http://schemas.openxmlformats.org/drawingml/2006/picture">
                   <pic:nvPicPr>
-                    <pic:cNvPr id="0" name="Picture 1" descr="C:\Users\Administrator\Downloads\Untitled Diagram.drawio.png"/>
+                    <pic:cNvPr id="0" name="Picture 1"/>
                     <pic:cNvPicPr>
                       <a:picLocks noChangeAspect="1" noChangeArrowheads="1"/>
                     </pic:cNvPicPr>

</xml_diff>